<commit_message>
Add Alto/Medio/Bajo levels per variable and additional criteria ranges
Nueva hoja Variables_Rangos con el formato de la hoja Variables del
archivo; niveles por asociado para deuda, deuda/ingreso, fondo,
aportaciones, cuotas de aportacion vencidas, categorias y tramo de edad.

Co-Authored-By: Claude Opus 5.5 <noreply@anthropic.com>
Claude-Session: https://claude.ai/code/session_01NvaGFJgAfQMh5qCNV2Qhij
</commit_message>
<xml_diff>
--- a/analisis-base-preevaluada-oct2026/Informe_Riesgos_Base_PreEvaluada.docx
+++ b/analisis-base-preevaluada-oct2026/Informe_Riesgos_Base_PreEvaluada.docx
@@ -292,7 +292,7 @@
         <w:t xml:space="preserve">Segmentacion_Riesgos_Base_PreEvaluada.xlsx</w:t>
       </w:r>
       <w:r>
-        <w:t xml:space="preserve">. Contiene 123,228 fórmulas y 0 errores. Cada número de este informe sale de ese libro.</w:t>
+        <w:t xml:space="preserve">. Contiene 143,869 fórmulas y 0 errores. Cada número de este informe sale de ese libro.</w:t>
       </w:r>
     </w:p>
     <w:p>
@@ -2470,7 +2470,7 @@
       </w:r>
     </w:p>
     <w:bookmarkEnd w:id="24"/>
-    <w:bookmarkStart w:id="32" w:name="X7cbb798feae4fe6b6edb9091252e11996b0f41d"/>
+    <w:bookmarkStart w:id="33" w:name="X7cbb798feae4fe6b6edb9091252e11996b0f41d"/>
     <w:p>
       <w:pPr>
         <w:pStyle w:val="Heading1"/>
@@ -2485,6 +2485,196 @@
       </w:pPr>
       <w:r>
         <w:t xml:space="preserve">Cada límite inferior está incluido en su rango. Los porcentajes se calculan sobre los 2,262 asociados.</w:t>
+      </w:r>
+    </w:p>
+    <w:p>
+      <w:pPr>
+        <w:pStyle w:val="BodyText"/>
+      </w:pPr>
+      <w:r>
+        <w:t xml:space="preserve">La hoja</w:t>
+      </w:r>
+      <w:r>
+        <w:t xml:space="preserve"> </w:t>
+      </w:r>
+      <w:r>
+        <w:rPr>
+          <w:rStyle w:val="VerbatimChar"/>
+          <w:bCs/>
+          <w:b/>
+        </w:rPr>
+        <w:t xml:space="preserve">Variables_Rangos</w:t>
+      </w:r>
+      <w:r>
+        <w:t xml:space="preserve"> </w:t>
+      </w:r>
+      <w:r>
+        <w:t xml:space="preserve">del libro presenta todas las variables con el mismo formato de la hoja</w:t>
+      </w:r>
+      <w:r>
+        <w:t xml:space="preserve"> </w:t>
+      </w:r>
+      <w:r>
+        <w:t xml:space="preserve">“</w:t>
+      </w:r>
+      <w:r>
+        <w:t xml:space="preserve">Variables</w:t>
+      </w:r>
+      <w:r>
+        <w:t xml:space="preserve">”</w:t>
+      </w:r>
+      <w:r>
+        <w:t xml:space="preserve"> </w:t>
+      </w:r>
+      <w:r>
+        <w:t xml:space="preserve">del archivo (rango → nivel). El nivel de cada asociado está en</w:t>
+      </w:r>
+      <w:r>
+        <w:t xml:space="preserve"> </w:t>
+      </w:r>
+      <w:r>
+        <w:rPr>
+          <w:rStyle w:val="VerbatimChar"/>
+        </w:rPr>
+        <w:t xml:space="preserve">BD_CLASIFICADA</w:t>
+      </w:r>
+      <w:r>
+        <w:t xml:space="preserve">, en las columnas</w:t>
+      </w:r>
+      <w:r>
+        <w:t xml:space="preserve"> </w:t>
+      </w:r>
+      <w:r>
+        <w:rPr>
+          <w:rStyle w:val="VerbatimChar"/>
+        </w:rPr>
+        <w:t xml:space="preserve">NIVEL_ANTIGUEDAD</w:t>
+      </w:r>
+      <w:r>
+        <w:t xml:space="preserve">,</w:t>
+      </w:r>
+      <w:r>
+        <w:t xml:space="preserve"> </w:t>
+      </w:r>
+      <w:r>
+        <w:rPr>
+          <w:rStyle w:val="VerbatimChar"/>
+        </w:rPr>
+        <w:t xml:space="preserve">NIVEL_INGRESO</w:t>
+      </w:r>
+      <w:r>
+        <w:t xml:space="preserve">,</w:t>
+      </w:r>
+      <w:r>
+        <w:t xml:space="preserve"> </w:t>
+      </w:r>
+      <w:r>
+        <w:rPr>
+          <w:rStyle w:val="VerbatimChar"/>
+        </w:rPr>
+        <w:t xml:space="preserve">NIVEL_DEUDA</w:t>
+      </w:r>
+      <w:r>
+        <w:t xml:space="preserve">,</w:t>
+      </w:r>
+      <w:r>
+        <w:t xml:space="preserve"> </w:t>
+      </w:r>
+      <w:r>
+        <w:rPr>
+          <w:rStyle w:val="VerbatimChar"/>
+        </w:rPr>
+        <w:t xml:space="preserve">NIVEL_DEUDA_INGRESO</w:t>
+      </w:r>
+      <w:r>
+        <w:t xml:space="preserve">,</w:t>
+      </w:r>
+      <w:r>
+        <w:t xml:space="preserve"> </w:t>
+      </w:r>
+      <w:r>
+        <w:rPr>
+          <w:rStyle w:val="VerbatimChar"/>
+        </w:rPr>
+        <w:t xml:space="preserve">NIVEL_RESPALDO_FONDO</w:t>
+      </w:r>
+      <w:r>
+        <w:t xml:space="preserve">,</w:t>
+      </w:r>
+      <w:r>
+        <w:t xml:space="preserve"> </w:t>
+      </w:r>
+      <w:r>
+        <w:rPr>
+          <w:rStyle w:val="VerbatimChar"/>
+        </w:rPr>
+        <w:t xml:space="preserve">NIVEL_COBERTURA_FONDO</w:t>
+      </w:r>
+      <w:r>
+        <w:t xml:space="preserve">,</w:t>
+      </w:r>
+      <w:r>
+        <w:t xml:space="preserve"> </w:t>
+      </w:r>
+      <w:r>
+        <w:rPr>
+          <w:rStyle w:val="VerbatimChar"/>
+        </w:rPr>
+        <w:t xml:space="preserve">NIVEL_APORTACIONES</w:t>
+      </w:r>
+      <w:r>
+        <w:t xml:space="preserve">,</w:t>
+      </w:r>
+      <w:r>
+        <w:t xml:space="preserve"> </w:t>
+      </w:r>
+      <w:r>
+        <w:rPr>
+          <w:rStyle w:val="VerbatimChar"/>
+        </w:rPr>
+        <w:t xml:space="preserve">NIVEL_MORA_APORTACIONES</w:t>
+      </w:r>
+      <w:r>
+        <w:t xml:space="preserve">,</w:t>
+      </w:r>
+      <w:r>
+        <w:t xml:space="preserve"> </w:t>
+      </w:r>
+      <w:r>
+        <w:rPr>
+          <w:rStyle w:val="VerbatimChar"/>
+        </w:rPr>
+        <w:t xml:space="preserve">NIVEL_CAT_INTERNA</w:t>
+      </w:r>
+      <w:r>
+        <w:t xml:space="preserve">,</w:t>
+      </w:r>
+      <w:r>
+        <w:t xml:space="preserve"> </w:t>
+      </w:r>
+      <w:r>
+        <w:rPr>
+          <w:rStyle w:val="VerbatimChar"/>
+        </w:rPr>
+        <w:t xml:space="preserve">NIVEL_CAT_EXTERNA</w:t>
+      </w:r>
+      <w:r>
+        <w:t xml:space="preserve"> </w:t>
+      </w:r>
+      <w:r>
+        <w:t xml:space="preserve">y</w:t>
+      </w:r>
+      <w:r>
+        <w:t xml:space="preserve"> </w:t>
+      </w:r>
+      <w:r>
+        <w:rPr>
+          <w:rStyle w:val="VerbatimChar"/>
+        </w:rPr>
+        <w:t xml:space="preserve">TRAMO_EDAD</w:t>
+      </w:r>
+      <w:r>
+        <w:t xml:space="preserve">.</w:t>
       </w:r>
     </w:p>
     <w:bookmarkStart w:id="25" w:name="X9ef8788694238191d627fd13d26e70b4f3e529c"/>
@@ -3272,7 +3462,7 @@
               <w:jc w:val="left"/>
             </w:pPr>
             <w:r>
-              <w:t xml:space="preserve">Medio-bajo</w:t>
+              <w:t xml:space="preserve">Bajo</w:t>
             </w:r>
           </w:p>
         </w:tc>
@@ -3358,7 +3548,7 @@
               <w:jc w:val="left"/>
             </w:pPr>
             <w:r>
-              <w:t xml:space="preserve">Bajo</w:t>
+              <w:t xml:space="preserve">Muy bajo</w:t>
             </w:r>
           </w:p>
         </w:tc>
@@ -5359,13 +5549,13 @@
       </w:r>
     </w:p>
     <w:bookmarkEnd w:id="30"/>
-    <w:bookmarkStart w:id="31" w:name="historial-y-clasificación"/>
+    <w:bookmarkStart w:id="31" w:name="otros-criterios-con-rango-y-nivel"/>
     <w:p>
       <w:pPr>
         <w:pStyle w:val="Heading2"/>
       </w:pPr>
       <w:r>
-        <w:t xml:space="preserve">3.7 Historial y clasificación</w:t>
+        <w:t xml:space="preserve">3.7 Otros criterios con rango y nivel</w:t>
       </w:r>
     </w:p>
     <w:tbl>
@@ -5392,6 +5582,506 @@
               <w:jc w:val="left"/>
             </w:pPr>
             <w:r>
+              <w:t xml:space="preserve">Criterio (columna)</w:t>
+            </w:r>
+          </w:p>
+        </w:tc>
+        <w:tc>
+          <w:tcPr/>
+          <w:p>
+            <w:pPr>
+              <w:pStyle w:val="Compact"/>
+              <w:jc w:val="left"/>
+            </w:pPr>
+            <w:r>
+              <w:t xml:space="preserve">Rango → nivel</w:t>
+            </w:r>
+          </w:p>
+        </w:tc>
+        <w:tc>
+          <w:tcPr/>
+          <w:p>
+            <w:pPr>
+              <w:pStyle w:val="Compact"/>
+              <w:jc w:val="left"/>
+            </w:pPr>
+            <w:r>
+              <w:t xml:space="preserve">Asociados</w:t>
+            </w:r>
+          </w:p>
+        </w:tc>
+      </w:tr>
+      <w:tr>
+        <w:tc>
+          <w:tcPr/>
+          <w:p>
+            <w:pPr>
+              <w:pStyle w:val="Compact"/>
+              <w:jc w:val="left"/>
+            </w:pPr>
+            <w:r>
+              <w:t xml:space="preserve">Cuotas de aportación vencidas (</w:t>
+            </w:r>
+            <w:r>
+              <w:rPr>
+                <w:rStyle w:val="VerbatimChar"/>
+              </w:rPr>
+              <w:t xml:space="preserve">CUOTAS_VENC_APORT</w:t>
+            </w:r>
+            <w:r>
+              <w:t xml:space="preserve">),</w:t>
+            </w:r>
+            <w:r>
+              <w:t xml:space="preserve"> </w:t>
+            </w:r>
+            <w:r>
+              <w:rPr>
+                <w:bCs/>
+                <w:b/>
+              </w:rPr>
+              <w:t xml:space="preserve">nivel de riesgo</w:t>
+            </w:r>
+          </w:p>
+        </w:tc>
+        <w:tc>
+          <w:tcPr/>
+          <w:p>
+            <w:pPr>
+              <w:pStyle w:val="Compact"/>
+              <w:jc w:val="left"/>
+            </w:pPr>
+            <w:r>
+              <w:t xml:space="preserve">0 (al día) → Bajo · 1 a 2 → Medio · 3 o más → Alto</w:t>
+            </w:r>
+          </w:p>
+        </w:tc>
+        <w:tc>
+          <w:tcPr/>
+          <w:p>
+            <w:pPr>
+              <w:pStyle w:val="Compact"/>
+              <w:jc w:val="left"/>
+            </w:pPr>
+            <w:r>
+              <w:t xml:space="preserve">2,076 · 79 · 107</w:t>
+            </w:r>
+          </w:p>
+        </w:tc>
+      </w:tr>
+      <w:tr>
+        <w:tc>
+          <w:tcPr/>
+          <w:p>
+            <w:pPr>
+              <w:pStyle w:val="Compact"/>
+              <w:jc w:val="left"/>
+            </w:pPr>
+            <w:r>
+              <w:t xml:space="preserve">Categoría interna (</w:t>
+            </w:r>
+            <w:r>
+              <w:rPr>
+                <w:rStyle w:val="VerbatimChar"/>
+              </w:rPr>
+              <w:t xml:space="preserve">MAX_CAT_RIESGO</w:t>
+            </w:r>
+            <w:r>
+              <w:t xml:space="preserve">),</w:t>
+            </w:r>
+            <w:r>
+              <w:t xml:space="preserve"> </w:t>
+            </w:r>
+            <w:r>
+              <w:rPr>
+                <w:bCs/>
+                <w:b/>
+              </w:rPr>
+              <w:t xml:space="preserve">nivel de riesgo</w:t>
+            </w:r>
+          </w:p>
+        </w:tc>
+        <w:tc>
+          <w:tcPr/>
+          <w:p>
+            <w:pPr>
+              <w:pStyle w:val="Compact"/>
+              <w:jc w:val="left"/>
+            </w:pPr>
+            <w:r>
+              <w:t xml:space="preserve">A1 → Bajo · A2 → Medio · B a E → Alto · sin categoría → Sin información</w:t>
+            </w:r>
+          </w:p>
+        </w:tc>
+        <w:tc>
+          <w:tcPr/>
+          <w:p>
+            <w:pPr>
+              <w:pStyle w:val="Compact"/>
+              <w:jc w:val="left"/>
+            </w:pPr>
+            <w:r>
+              <w:t xml:space="preserve">1,356 · 22 · 0 · 884</w:t>
+            </w:r>
+          </w:p>
+        </w:tc>
+      </w:tr>
+      <w:tr>
+        <w:tc>
+          <w:tcPr/>
+          <w:p>
+            <w:pPr>
+              <w:pStyle w:val="Compact"/>
+              <w:jc w:val="left"/>
+            </w:pPr>
+            <w:r>
+              <w:t xml:space="preserve">Calificación SSF (</w:t>
+            </w:r>
+            <w:r>
+              <w:rPr>
+                <w:rStyle w:val="VerbatimChar"/>
+              </w:rPr>
+              <w:t xml:space="preserve">CALIFICACION_SSF</w:t>
+            </w:r>
+            <w:r>
+              <w:t xml:space="preserve">),</w:t>
+            </w:r>
+            <w:r>
+              <w:t xml:space="preserve"> </w:t>
+            </w:r>
+            <w:r>
+              <w:rPr>
+                <w:bCs/>
+                <w:b/>
+              </w:rPr>
+              <w:t xml:space="preserve">nivel de riesgo</w:t>
+            </w:r>
+          </w:p>
+        </w:tc>
+        <w:tc>
+          <w:tcPr/>
+          <w:p>
+            <w:pPr>
+              <w:pStyle w:val="Compact"/>
+              <w:jc w:val="left"/>
+            </w:pPr>
+            <w:r>
+              <w:t xml:space="preserve">A1 → Bajo · A2 → Medio · B a E → Alto · sin calificación → Sin información</w:t>
+            </w:r>
+          </w:p>
+        </w:tc>
+        <w:tc>
+          <w:tcPr/>
+          <w:p>
+            <w:pPr>
+              <w:pStyle w:val="Compact"/>
+              <w:jc w:val="left"/>
+            </w:pPr>
+            <w:r>
+              <w:t xml:space="preserve">1,813 · 11 · 0 · 438</w:t>
+            </w:r>
+          </w:p>
+        </w:tc>
+      </w:tr>
+      <w:tr>
+        <w:tc>
+          <w:tcPr/>
+          <w:p>
+            <w:pPr>
+              <w:pStyle w:val="Compact"/>
+              <w:jc w:val="left"/>
+            </w:pPr>
+            <w:r>
+              <w:t xml:space="preserve">Aportaciones acumuladas (</w:t>
+            </w:r>
+            <w:r>
+              <w:rPr>
+                <w:rStyle w:val="VerbatimChar"/>
+              </w:rPr>
+              <w:t xml:space="preserve">MONTO_TOTAL_APORTACIONES</w:t>
+            </w:r>
+            <w:r>
+              <w:t xml:space="preserve">), nivel de aportación (no es riesgo)</w:t>
+            </w:r>
+          </w:p>
+        </w:tc>
+        <w:tc>
+          <w:tcPr/>
+          <w:p>
+            <w:pPr>
+              <w:pStyle w:val="Compact"/>
+              <w:jc w:val="left"/>
+            </w:pPr>
+            <w:r>
+              <w:t xml:space="preserve">menos de $500 → Bajo · $500 a $1,999.99 → Medio · $2,000 o más → Alto</w:t>
+            </w:r>
+          </w:p>
+        </w:tc>
+        <w:tc>
+          <w:tcPr/>
+          <w:p>
+            <w:pPr>
+              <w:pStyle w:val="Compact"/>
+              <w:jc w:val="left"/>
+            </w:pPr>
+            <w:r>
+              <w:t xml:space="preserve">446 · 1,201 · 615</w:t>
+            </w:r>
+          </w:p>
+        </w:tc>
+      </w:tr>
+      <w:tr>
+        <w:tc>
+          <w:tcPr/>
+          <w:p>
+            <w:pPr>
+              <w:pStyle w:val="Compact"/>
+              <w:jc w:val="left"/>
+            </w:pPr>
+            <w:r>
+              <w:t xml:space="preserve">Fondo ÷ ingreso, nivel de respaldo (no es riesgo)</w:t>
+            </w:r>
+          </w:p>
+        </w:tc>
+        <w:tc>
+          <w:tcPr/>
+          <w:p>
+            <w:pPr>
+              <w:pStyle w:val="Compact"/>
+              <w:jc w:val="left"/>
+            </w:pPr>
+            <w:r>
+              <w:t xml:space="preserve">menos de 1 mes → Bajo · 1 a menos de 6 → Medio · 6 a menos de 12 → Alto · 12 o más → Muy alto</w:t>
+            </w:r>
+          </w:p>
+        </w:tc>
+        <w:tc>
+          <w:tcPr/>
+          <w:p>
+            <w:pPr>
+              <w:pStyle w:val="Compact"/>
+              <w:jc w:val="left"/>
+            </w:pPr>
+            <w:r>
+              <w:t xml:space="preserve">349 · 190 · 86 · 164</w:t>
+            </w:r>
+          </w:p>
+        </w:tc>
+      </w:tr>
+      <w:tr>
+        <w:tc>
+          <w:tcPr/>
+          <w:p>
+            <w:pPr>
+              <w:pStyle w:val="Compact"/>
+              <w:jc w:val="left"/>
+            </w:pPr>
+            <w:r>
+              <w:t xml:space="preserve">Edad al 30/09/2026, tramo descriptivo</w:t>
+            </w:r>
+          </w:p>
+        </w:tc>
+        <w:tc>
+          <w:tcPr/>
+          <w:p>
+            <w:pPr>
+              <w:pStyle w:val="Compact"/>
+              <w:jc w:val="left"/>
+            </w:pPr>
+            <w:r>
+              <w:t xml:space="preserve">30–39 · 40–49 · 50–55 · mayor de 55</w:t>
+            </w:r>
+          </w:p>
+        </w:tc>
+        <w:tc>
+          <w:tcPr/>
+          <w:p>
+            <w:pPr>
+              <w:pStyle w:val="Compact"/>
+              <w:jc w:val="left"/>
+            </w:pPr>
+            <w:r>
+              <w:t xml:space="preserve">574 · 876 · 804 · 8</w:t>
+            </w:r>
+          </w:p>
+        </w:tc>
+      </w:tr>
+      <w:tr>
+        <w:tc>
+          <w:tcPr/>
+          <w:p>
+            <w:pPr>
+              <w:pStyle w:val="Compact"/>
+              <w:jc w:val="left"/>
+            </w:pPr>
+            <w:r>
+              <w:t xml:space="preserve">Tiene crédito vigente / tiene tarjeta</w:t>
+            </w:r>
+          </w:p>
+        </w:tc>
+        <w:tc>
+          <w:tcPr/>
+          <w:p>
+            <w:pPr>
+              <w:pStyle w:val="Compact"/>
+              <w:jc w:val="left"/>
+            </w:pPr>
+            <w:r>
+              <w:t xml:space="preserve">SÍ / NO</w:t>
+            </w:r>
+          </w:p>
+        </w:tc>
+        <w:tc>
+          <w:tcPr/>
+          <w:p>
+            <w:pPr>
+              <w:pStyle w:val="Compact"/>
+              <w:jc w:val="left"/>
+            </w:pPr>
+            <w:r>
+              <w:t xml:space="preserve">823 / 1,439 · 966 / 1,296</w:t>
+            </w:r>
+          </w:p>
+        </w:tc>
+      </w:tr>
+    </w:tbl>
+    <w:p>
+      <w:pPr>
+        <w:pStyle w:val="BodyText"/>
+      </w:pPr>
+      <w:r>
+        <w:t xml:space="preserve">Por qué algunos criterios no llevan nivel de riesgo:</w:t>
+      </w:r>
+    </w:p>
+    <w:p>
+      <w:pPr>
+        <w:numPr>
+          <w:ilvl w:val="0"/>
+          <w:numId w:val="1007"/>
+        </w:numPr>
+        <w:pStyle w:val="Compact"/>
+      </w:pPr>
+      <w:r>
+        <w:rPr>
+          <w:bCs/>
+          <w:b/>
+        </w:rPr>
+        <w:t xml:space="preserve">Edad:</w:t>
+      </w:r>
+      <w:r>
+        <w:t xml:space="preserve"> </w:t>
+      </w:r>
+      <w:r>
+        <w:t xml:space="preserve">se presenta solo como tramo descriptivo. Asignarle un nivel de riesgo requiere una política institucional.</w:t>
+      </w:r>
+    </w:p>
+    <w:p>
+      <w:pPr>
+        <w:numPr>
+          <w:ilvl w:val="0"/>
+          <w:numId w:val="1007"/>
+        </w:numPr>
+        <w:pStyle w:val="Compact"/>
+      </w:pPr>
+      <w:r>
+        <w:rPr>
+          <w:bCs/>
+          <w:b/>
+        </w:rPr>
+        <w:t xml:space="preserve">Aportaciones y fondo:</w:t>
+      </w:r>
+      <w:r>
+        <w:t xml:space="preserve"> </w:t>
+      </w:r>
+      <w:r>
+        <w:t xml:space="preserve">indican vínculo y respaldo con la cooperativa. No se les atribuye reducción de riesgo mientras no se valide si están disponibles.</w:t>
+      </w:r>
+    </w:p>
+    <w:p>
+      <w:pPr>
+        <w:pStyle w:val="FirstParagraph"/>
+      </w:pPr>
+      <w:r>
+        <w:t xml:space="preserve">Cortes usados:</w:t>
+      </w:r>
+    </w:p>
+    <w:p>
+      <w:pPr>
+        <w:numPr>
+          <w:ilvl w:val="0"/>
+          <w:numId w:val="1008"/>
+        </w:numPr>
+        <w:pStyle w:val="Compact"/>
+      </w:pPr>
+      <w:r>
+        <w:t xml:space="preserve">Aportaciones: $500 (≈ P20) y $2,000 (≈ P73).</w:t>
+      </w:r>
+    </w:p>
+    <w:p>
+      <w:pPr>
+        <w:numPr>
+          <w:ilvl w:val="0"/>
+          <w:numId w:val="1008"/>
+        </w:numPr>
+        <w:pStyle w:val="Compact"/>
+      </w:pPr>
+      <w:r>
+        <w:t xml:space="preserve">Cuotas vencidas: 1 cuota (cualquier atraso) y 3 cuotas (un trimestre de atraso).</w:t>
+      </w:r>
+    </w:p>
+    <w:p>
+      <w:pPr>
+        <w:pStyle w:val="FirstParagraph"/>
+      </w:pPr>
+      <w:r>
+        <w:t xml:space="preserve">Todos estos cortes se pueden editar en la hoja</w:t>
+      </w:r>
+      <w:r>
+        <w:t xml:space="preserve"> </w:t>
+      </w:r>
+      <w:r>
+        <w:rPr>
+          <w:rStyle w:val="VerbatimChar"/>
+        </w:rPr>
+        <w:t xml:space="preserve">Parametros</w:t>
+      </w:r>
+      <w:r>
+        <w:t xml:space="preserve">.</w:t>
+      </w:r>
+    </w:p>
+    <w:bookmarkEnd w:id="31"/>
+    <w:bookmarkStart w:id="32" w:name="historial-y-clasificación"/>
+    <w:p>
+      <w:pPr>
+        <w:pStyle w:val="Heading2"/>
+      </w:pPr>
+      <w:r>
+        <w:t xml:space="preserve">3.8 Historial y clasificación</w:t>
+      </w:r>
+    </w:p>
+    <w:tbl>
+      <w:tblPr>
+        <w:tblStyle w:val="Table"/>
+        <w:tblW w:type="pct" w:w="5000"/>
+        <w:tblLook w:firstRow="1" w:lastRow="0" w:firstColumn="0" w:lastColumn="0" w:noHBand="0" w:noVBand="0" w:val="0020"/>
+        <w:jc w:val="start"/>
+      </w:tblPr>
+      <w:tblGrid>
+        <w:gridCol w:w="2640"/>
+        <w:gridCol w:w="2640"/>
+        <w:gridCol w:w="2640"/>
+      </w:tblGrid>
+      <w:tr>
+        <w:trPr>
+          <w:tblHeader w:val="true"/>
+        </w:trPr>
+        <w:tc>
+          <w:tcPr/>
+          <w:p>
+            <w:pPr>
+              <w:pStyle w:val="Compact"/>
+              <w:jc w:val="left"/>
+            </w:pPr>
+            <w:r>
               <w:t xml:space="preserve">Variable</w:t>
             </w:r>
           </w:p>
@@ -5641,9 +6331,9 @@
         </w:pict>
       </w:r>
     </w:p>
-    <w:bookmarkEnd w:id="31"/>
     <w:bookmarkEnd w:id="32"/>
-    <w:bookmarkStart w:id="33" w:name="evaluación-conjunta-y-alertas"/>
+    <w:bookmarkEnd w:id="33"/>
+    <w:bookmarkStart w:id="34" w:name="evaluación-conjunta-y-alertas"/>
     <w:p>
       <w:pPr>
         <w:pStyle w:val="Heading1"/>
@@ -6309,7 +6999,7 @@
       <w:pPr>
         <w:numPr>
           <w:ilvl w:val="0"/>
-          <w:numId w:val="1007"/>
+          <w:numId w:val="1009"/>
         </w:numPr>
         <w:pStyle w:val="Compact"/>
       </w:pPr>
@@ -6331,7 +7021,7 @@
       <w:pPr>
         <w:numPr>
           <w:ilvl w:val="0"/>
-          <w:numId w:val="1007"/>
+          <w:numId w:val="1009"/>
         </w:numPr>
         <w:pStyle w:val="Compact"/>
       </w:pPr>
@@ -6353,7 +7043,7 @@
       <w:pPr>
         <w:numPr>
           <w:ilvl w:val="0"/>
-          <w:numId w:val="1007"/>
+          <w:numId w:val="1009"/>
         </w:numPr>
         <w:pStyle w:val="Compact"/>
       </w:pPr>
@@ -6375,7 +7065,7 @@
       <w:pPr>
         <w:numPr>
           <w:ilvl w:val="0"/>
-          <w:numId w:val="1007"/>
+          <w:numId w:val="1009"/>
         </w:numPr>
         <w:pStyle w:val="Compact"/>
       </w:pPr>
@@ -6400,8 +7090,8 @@
         </w:pict>
       </w:r>
     </w:p>
-    <w:bookmarkEnd w:id="33"/>
-    <w:bookmarkStart w:id="34" w:name="evaluación-por-producto"/>
+    <w:bookmarkEnd w:id="34"/>
+    <w:bookmarkStart w:id="35" w:name="evaluación-por-producto"/>
     <w:p>
       <w:pPr>
         <w:pStyle w:val="Heading1"/>
@@ -6889,7 +7579,7 @@
       <w:pPr>
         <w:numPr>
           <w:ilvl w:val="0"/>
-          <w:numId w:val="1008"/>
+          <w:numId w:val="1010"/>
         </w:numPr>
         <w:pStyle w:val="Compact"/>
       </w:pPr>
@@ -6977,7 +7667,7 @@
       <w:pPr>
         <w:numPr>
           <w:ilvl w:val="0"/>
-          <w:numId w:val="1008"/>
+          <w:numId w:val="1010"/>
         </w:numPr>
         <w:pStyle w:val="Compact"/>
       </w:pPr>
@@ -7027,7 +7717,7 @@
       <w:pPr>
         <w:numPr>
           <w:ilvl w:val="0"/>
-          <w:numId w:val="1008"/>
+          <w:numId w:val="1010"/>
         </w:numPr>
         <w:pStyle w:val="Compact"/>
       </w:pPr>
@@ -7062,7 +7752,7 @@
       <w:pPr>
         <w:numPr>
           <w:ilvl w:val="0"/>
-          <w:numId w:val="1008"/>
+          <w:numId w:val="1010"/>
         </w:numPr>
         <w:pStyle w:val="Compact"/>
       </w:pPr>
@@ -7084,7 +7774,7 @@
       <w:pPr>
         <w:numPr>
           <w:ilvl w:val="0"/>
-          <w:numId w:val="1008"/>
+          <w:numId w:val="1010"/>
         </w:numPr>
         <w:pStyle w:val="Compact"/>
       </w:pPr>
@@ -7099,8 +7789,8 @@
         </w:pict>
       </w:r>
     </w:p>
-    <w:bookmarkEnd w:id="34"/>
-    <w:bookmarkStart w:id="35" w:name="metodología-supuestos-y-restricciones"/>
+    <w:bookmarkEnd w:id="35"/>
+    <w:bookmarkStart w:id="36" w:name="metodología-supuestos-y-restricciones"/>
     <w:p>
       <w:pPr>
         <w:pStyle w:val="Heading1"/>
@@ -7158,7 +7848,7 @@
       <w:pPr>
         <w:numPr>
           <w:ilvl w:val="0"/>
-          <w:numId w:val="1009"/>
+          <w:numId w:val="1011"/>
         </w:numPr>
         <w:pStyle w:val="Compact"/>
       </w:pPr>
@@ -7170,7 +7860,7 @@
       <w:pPr>
         <w:numPr>
           <w:ilvl w:val="0"/>
-          <w:numId w:val="1009"/>
+          <w:numId w:val="1011"/>
         </w:numPr>
         <w:pStyle w:val="Compact"/>
       </w:pPr>
@@ -7182,7 +7872,7 @@
       <w:pPr>
         <w:numPr>
           <w:ilvl w:val="0"/>
-          <w:numId w:val="1009"/>
+          <w:numId w:val="1011"/>
         </w:numPr>
         <w:pStyle w:val="Compact"/>
       </w:pPr>
@@ -7194,7 +7884,7 @@
       <w:pPr>
         <w:numPr>
           <w:ilvl w:val="0"/>
-          <w:numId w:val="1009"/>
+          <w:numId w:val="1011"/>
         </w:numPr>
         <w:pStyle w:val="Compact"/>
       </w:pPr>
@@ -7219,7 +7909,7 @@
       <w:pPr>
         <w:numPr>
           <w:ilvl w:val="0"/>
-          <w:numId w:val="1009"/>
+          <w:numId w:val="1011"/>
         </w:numPr>
         <w:pStyle w:val="Compact"/>
       </w:pPr>
@@ -7243,7 +7933,7 @@
       <w:pPr>
         <w:numPr>
           <w:ilvl w:val="0"/>
-          <w:numId w:val="1010"/>
+          <w:numId w:val="1012"/>
         </w:numPr>
         <w:pStyle w:val="Compact"/>
       </w:pPr>
@@ -7255,7 +7945,7 @@
       <w:pPr>
         <w:numPr>
           <w:ilvl w:val="0"/>
-          <w:numId w:val="1010"/>
+          <w:numId w:val="1012"/>
         </w:numPr>
         <w:pStyle w:val="Compact"/>
       </w:pPr>
@@ -7267,7 +7957,7 @@
       <w:pPr>
         <w:numPr>
           <w:ilvl w:val="0"/>
-          <w:numId w:val="1010"/>
+          <w:numId w:val="1012"/>
         </w:numPr>
         <w:pStyle w:val="Compact"/>
       </w:pPr>
@@ -7288,7 +7978,7 @@
       <w:pPr>
         <w:numPr>
           <w:ilvl w:val="0"/>
-          <w:numId w:val="1010"/>
+          <w:numId w:val="1012"/>
         </w:numPr>
         <w:pStyle w:val="Compact"/>
       </w:pPr>
@@ -7327,7 +8017,7 @@
       <w:pPr>
         <w:numPr>
           <w:ilvl w:val="0"/>
-          <w:numId w:val="1010"/>
+          <w:numId w:val="1012"/>
         </w:numPr>
         <w:pStyle w:val="Compact"/>
       </w:pPr>
@@ -7339,7 +8029,7 @@
       <w:pPr>
         <w:numPr>
           <w:ilvl w:val="0"/>
-          <w:numId w:val="1010"/>
+          <w:numId w:val="1012"/>
         </w:numPr>
         <w:pStyle w:val="Compact"/>
       </w:pPr>
@@ -7363,7 +8053,7 @@
       <w:pPr>
         <w:numPr>
           <w:ilvl w:val="0"/>
-          <w:numId w:val="1011"/>
+          <w:numId w:val="1013"/>
         </w:numPr>
         <w:pStyle w:val="Compact"/>
       </w:pPr>
@@ -7375,7 +8065,7 @@
       <w:pPr>
         <w:numPr>
           <w:ilvl w:val="0"/>
-          <w:numId w:val="1011"/>
+          <w:numId w:val="1013"/>
         </w:numPr>
         <w:pStyle w:val="Compact"/>
       </w:pPr>
@@ -7399,7 +8089,7 @@
       <w:pPr>
         <w:numPr>
           <w:ilvl w:val="0"/>
-          <w:numId w:val="1011"/>
+          <w:numId w:val="1013"/>
         </w:numPr>
         <w:pStyle w:val="Compact"/>
       </w:pPr>
@@ -7427,7 +8117,7 @@
       <w:pPr>
         <w:numPr>
           <w:ilvl w:val="0"/>
-          <w:numId w:val="1011"/>
+          <w:numId w:val="1013"/>
         </w:numPr>
         <w:pStyle w:val="Compact"/>
       </w:pPr>
@@ -7476,8 +8166,8 @@
         </w:pict>
       </w:r>
     </w:p>
-    <w:bookmarkEnd w:id="35"/>
-    <w:bookmarkStart w:id="36" w:name="recomendaciones-priorizadas-para-riesgos"/>
+    <w:bookmarkEnd w:id="36"/>
+    <w:bookmarkStart w:id="37" w:name="recomendaciones-priorizadas-para-riesgos"/>
     <w:p>
       <w:pPr>
         <w:pStyle w:val="Heading1"/>
@@ -7490,7 +8180,7 @@
       <w:pPr>
         <w:numPr>
           <w:ilvl w:val="0"/>
-          <w:numId w:val="1012"/>
+          <w:numId w:val="1014"/>
         </w:numPr>
         <w:pStyle w:val="Compact"/>
       </w:pPr>
@@ -7512,7 +8202,7 @@
       <w:pPr>
         <w:numPr>
           <w:ilvl w:val="0"/>
-          <w:numId w:val="1012"/>
+          <w:numId w:val="1014"/>
         </w:numPr>
         <w:pStyle w:val="Compact"/>
       </w:pPr>
@@ -7534,7 +8224,7 @@
       <w:pPr>
         <w:numPr>
           <w:ilvl w:val="0"/>
-          <w:numId w:val="1012"/>
+          <w:numId w:val="1014"/>
         </w:numPr>
         <w:pStyle w:val="Compact"/>
       </w:pPr>
@@ -7556,7 +8246,7 @@
       <w:pPr>
         <w:numPr>
           <w:ilvl w:val="0"/>
-          <w:numId w:val="1012"/>
+          <w:numId w:val="1014"/>
         </w:numPr>
         <w:pStyle w:val="Compact"/>
       </w:pPr>
@@ -7593,7 +8283,7 @@
       <w:pPr>
         <w:numPr>
           <w:ilvl w:val="0"/>
-          <w:numId w:val="1012"/>
+          <w:numId w:val="1014"/>
         </w:numPr>
         <w:pStyle w:val="Compact"/>
       </w:pPr>
@@ -7612,7 +8302,7 @@
       <w:pPr>
         <w:numPr>
           <w:ilvl w:val="0"/>
-          <w:numId w:val="1012"/>
+          <w:numId w:val="1014"/>
         </w:numPr>
         <w:pStyle w:val="Compact"/>
       </w:pPr>
@@ -7634,7 +8324,7 @@
       <w:pPr>
         <w:numPr>
           <w:ilvl w:val="0"/>
-          <w:numId w:val="1012"/>
+          <w:numId w:val="1014"/>
         </w:numPr>
         <w:pStyle w:val="Compact"/>
       </w:pPr>
@@ -7656,7 +8346,7 @@
       <w:pPr>
         <w:numPr>
           <w:ilvl w:val="0"/>
-          <w:numId w:val="1012"/>
+          <w:numId w:val="1014"/>
         </w:numPr>
         <w:pStyle w:val="Compact"/>
       </w:pPr>
@@ -7678,7 +8368,7 @@
       <w:pPr>
         <w:numPr>
           <w:ilvl w:val="0"/>
-          <w:numId w:val="1012"/>
+          <w:numId w:val="1014"/>
         </w:numPr>
         <w:pStyle w:val="Compact"/>
       </w:pPr>
@@ -7700,7 +8390,7 @@
       <w:pPr>
         <w:numPr>
           <w:ilvl w:val="0"/>
-          <w:numId w:val="1012"/>
+          <w:numId w:val="1014"/>
         </w:numPr>
         <w:pStyle w:val="Compact"/>
       </w:pPr>
@@ -7722,8 +8412,8 @@
         </w:pict>
       </w:r>
     </w:p>
-    <w:bookmarkEnd w:id="36"/>
-    <w:bookmarkStart w:id="37" w:name="X898a8fd7cf0697dbc3940610ff34969f1de0ea2"/>
+    <w:bookmarkEnd w:id="37"/>
+    <w:bookmarkStart w:id="38" w:name="X898a8fd7cf0697dbc3940610ff34969f1de0ea2"/>
     <w:p>
       <w:pPr>
         <w:pStyle w:val="Heading1"/>
@@ -7759,7 +8449,7 @@
       <w:pPr>
         <w:numPr>
           <w:ilvl w:val="0"/>
-          <w:numId w:val="1013"/>
+          <w:numId w:val="1015"/>
         </w:numPr>
         <w:pStyle w:val="Compact"/>
       </w:pPr>
@@ -7771,55 +8461,67 @@
       <w:pPr>
         <w:numPr>
           <w:ilvl w:val="0"/>
-          <w:numId w:val="1013"/>
+          <w:numId w:val="1015"/>
         </w:numPr>
         <w:pStyle w:val="Compact"/>
       </w:pPr>
       <w:r>
-        <w:t xml:space="preserve">el umbral para marcar un ingreso como atípico;</w:t>
+        <w:t xml:space="preserve">los otros criterios (aportaciones, cuotas de aportación vencidas, niveles de categoría y tramos de edad);</w:t>
       </w:r>
     </w:p>
     <w:p>
       <w:pPr>
         <w:numPr>
           <w:ilvl w:val="0"/>
-          <w:numId w:val="1013"/>
+          <w:numId w:val="1015"/>
         </w:numPr>
         <w:pStyle w:val="Compact"/>
       </w:pPr>
       <w:r>
-        <w:t xml:space="preserve">cómo tratar a los asociados sin historial interno y a los que tienen categoría A2;</w:t>
+        <w:t xml:space="preserve">el umbral para marcar un ingreso como atípico;</w:t>
       </w:r>
     </w:p>
     <w:p>
       <w:pPr>
         <w:numPr>
           <w:ilvl w:val="0"/>
-          <w:numId w:val="1013"/>
+          <w:numId w:val="1015"/>
         </w:numPr>
         <w:pStyle w:val="Compact"/>
       </w:pPr>
       <w:r>
-        <w:t xml:space="preserve">la tabla hipotecaria;</w:t>
+        <w:t xml:space="preserve">cómo tratar a los asociados sin historial interno y a los que tienen categoría A2;</w:t>
       </w:r>
     </w:p>
     <w:p>
       <w:pPr>
         <w:numPr>
           <w:ilvl w:val="0"/>
-          <w:numId w:val="1013"/>
+          <w:numId w:val="1015"/>
         </w:numPr>
         <w:pStyle w:val="Compact"/>
       </w:pPr>
       <w:r>
-        <w:t xml:space="preserve">la naturaleza del ingreso y del fondo;</w:t>
+        <w:t xml:space="preserve">la tabla hipotecaria;</w:t>
       </w:r>
     </w:p>
     <w:p>
       <w:pPr>
         <w:numPr>
           <w:ilvl w:val="0"/>
-          <w:numId w:val="1013"/>
+          <w:numId w:val="1015"/>
+        </w:numPr>
+        <w:pStyle w:val="Compact"/>
+      </w:pPr>
+      <w:r>
+        <w:t xml:space="preserve">la naturaleza del ingreso y del fondo;</w:t>
+      </w:r>
+    </w:p>
+    <w:p>
+      <w:pPr>
+        <w:numPr>
+          <w:ilvl w:val="0"/>
+          <w:numId w:val="1015"/>
         </w:numPr>
         <w:pStyle w:val="Compact"/>
       </w:pPr>
@@ -7847,7 +8549,7 @@
         <w:t xml:space="preserve">, en las celdas amarillas. Si Riesgos los cambia, el libro completo se recalcula.</w:t>
       </w:r>
     </w:p>
-    <w:bookmarkEnd w:id="37"/>
+    <w:bookmarkEnd w:id="38"/>
     <w:sectPr/>
   </w:body>
 </w:document>
@@ -8137,6 +8839,12 @@
     <w:abstractNumId w:val="991"/>
   </w:num>
   <w:num w:numId="1007">
+    <w:abstractNumId w:val="991"/>
+  </w:num>
+  <w:num w:numId="1008">
+    <w:abstractNumId w:val="991"/>
+  </w:num>
+  <w:num w:numId="1009">
     <w:abstractNumId w:val="99411"/>
     <w:lvlOverride w:ilvl="0">
       <w:startOverride w:val="1"/>
@@ -8166,16 +8874,16 @@
       <w:startOverride w:val="1"/>
     </w:lvlOverride>
   </w:num>
-  <w:num w:numId="1008">
-    <w:abstractNumId w:val="991"/>
-  </w:num>
-  <w:num w:numId="1009">
-    <w:abstractNumId w:val="991"/>
-  </w:num>
   <w:num w:numId="1010">
     <w:abstractNumId w:val="991"/>
   </w:num>
   <w:num w:numId="1011">
+    <w:abstractNumId w:val="991"/>
+  </w:num>
+  <w:num w:numId="1012">
+    <w:abstractNumId w:val="991"/>
+  </w:num>
+  <w:num w:numId="1013">
     <w:abstractNumId w:val="99411"/>
     <w:lvlOverride w:ilvl="0">
       <w:startOverride w:val="1"/>
@@ -8205,7 +8913,7 @@
       <w:startOverride w:val="1"/>
     </w:lvlOverride>
   </w:num>
-  <w:num w:numId="1012">
+  <w:num w:numId="1014">
     <w:abstractNumId w:val="99411"/>
     <w:lvlOverride w:ilvl="0">
       <w:startOverride w:val="1"/>
@@ -8235,7 +8943,7 @@
       <w:startOverride w:val="1"/>
     </w:lvlOverride>
   </w:num>
-  <w:num w:numId="1013">
+  <w:num w:numId="1015">
     <w:abstractNumId w:val="991"/>
   </w:num>
 </w:numbering>

</xml_diff>